<commit_message>
docs: add READMEs for checks and processing, rename cleaning → processing
- Add README to data_validation/processing with per-script data flow
  tables and a file transformation summary across all pipeline stages
- Expand data_validation/checks/README with per-notebook question lists;
  annotate 3_stop_times_checks outputs and their downstream consumers
- Rename data_validation/cleaning/ to data_validation/processing/ to
  better reflect that the scripts transform and restructure data, not
  only clean it; update all references in READMEs and notebook cells
</commit_message>
<xml_diff>
--- a/.work/06.02.docx
+++ b/.work/06.02.docx
@@ -951,6 +951,34 @@
           <w:lang w:eastAsia="en-GB"/>
           <w14:ligatures w14:val="none"/>
         </w:rPr>
+        <w:t>Redefinir el pes d’arrival a arrival</w:t>
+      </w:r>
+    </w:p>
+    <w:p>
+      <w:pPr>
+        <w:pStyle w:val="ListParagraph"/>
+        <w:numPr>
+          <w:ilvl w:val="1"/>
+          <w:numId w:val="1"/>
+        </w:numPr>
+        <w:shd w:val="clear" w:color="auto" w:fill="FFFFFF"/>
+        <w:spacing w:after="0" w:line="270" w:lineRule="atLeast"/>
+        <w:rPr>
+          <w:rFonts w:ascii="Arial" w:eastAsia="Times New Roman" w:hAnsi="Arial" w:cs="Arial"/>
+          <w:color w:val="202020"/>
+          <w:kern w:val="0"/>
+          <w:lang w:eastAsia="en-GB"/>
+          <w14:ligatures w14:val="none"/>
+        </w:rPr>
+      </w:pPr>
+      <w:r>
+        <w:rPr>
+          <w:rFonts w:ascii="Arial" w:eastAsia="Times New Roman" w:hAnsi="Arial" w:cs="Arial"/>
+          <w:color w:val="202020"/>
+          <w:kern w:val="0"/>
+          <w:lang w:eastAsia="en-GB"/>
+          <w14:ligatures w14:val="none"/>
+        </w:rPr>
         <w:t xml:space="preserve">Utilitzar la mateixa estructura que a </w:t>
       </w:r>
       <w:r>
@@ -1085,6 +1113,7 @@
           <w:lang w:eastAsia="en-GB"/>
           <w14:ligatures w14:val="none"/>
         </w:rPr>
+        <w:lastRenderedPageBreak/>
         <w:t>Segueixen havent arestes inventades o falten d’altres?</w:t>
       </w:r>
     </w:p>

</xml_diff>

<commit_message>
refactor: advance STOP_TIMES_FILE to the final pipeline output
STOP_TIMES_FILE now points to stop_times_doors.txt (the door-adjusted file)
instead of stop_times_sequence.txt. The intermediate file gets its own explicit
constant STOP_TIMES_SEQUENCE_FILE.

Update 3_stop_sequence.py and 4_doors_time.py to use the new constant names.
</commit_message>
<xml_diff>
--- a/.work/06.02.docx
+++ b/.work/06.02.docx
@@ -515,16 +515,16 @@
         <w:spacing w:after="0" w:line="270" w:lineRule="atLeast"/>
         <w:rPr>
           <w:rFonts w:ascii="Arial" w:eastAsia="Times New Roman" w:hAnsi="Arial" w:cs="Arial"/>
-          <w:color w:val="202020"/>
-          <w:kern w:val="0"/>
-          <w:lang w:eastAsia="en-GB"/>
-          <w14:ligatures w14:val="none"/>
-        </w:rPr>
-      </w:pPr>
-      <w:r>
-        <w:rPr>
-          <w:rFonts w:ascii="Arial" w:eastAsia="Times New Roman" w:hAnsi="Arial" w:cs="Arial"/>
-          <w:color w:val="202020"/>
+          <w:color w:val="8DD873" w:themeColor="accent6" w:themeTint="99"/>
+          <w:kern w:val="0"/>
+          <w:lang w:eastAsia="en-GB"/>
+          <w14:ligatures w14:val="none"/>
+        </w:rPr>
+      </w:pPr>
+      <w:r>
+        <w:rPr>
+          <w:rFonts w:ascii="Arial" w:eastAsia="Times New Roman" w:hAnsi="Arial" w:cs="Arial"/>
+          <w:color w:val="8DD873" w:themeColor="accent6" w:themeTint="99"/>
           <w:kern w:val="0"/>
           <w:lang w:eastAsia="en-GB"/>
           <w14:ligatures w14:val="none"/>
@@ -789,16 +789,16 @@
         <w:spacing w:after="0" w:line="270" w:lineRule="atLeast"/>
         <w:rPr>
           <w:rFonts w:ascii="Arial" w:eastAsia="Times New Roman" w:hAnsi="Arial" w:cs="Arial"/>
-          <w:color w:val="202020"/>
-          <w:kern w:val="0"/>
-          <w:lang w:eastAsia="en-GB"/>
-          <w14:ligatures w14:val="none"/>
-        </w:rPr>
-      </w:pPr>
-      <w:r>
-        <w:rPr>
-          <w:rFonts w:ascii="Arial" w:eastAsia="Times New Roman" w:hAnsi="Arial" w:cs="Arial"/>
-          <w:color w:val="202020"/>
+          <w:color w:val="8DD873" w:themeColor="accent6" w:themeTint="99"/>
+          <w:kern w:val="0"/>
+          <w:lang w:eastAsia="en-GB"/>
+          <w14:ligatures w14:val="none"/>
+        </w:rPr>
+      </w:pPr>
+      <w:r>
+        <w:rPr>
+          <w:rFonts w:ascii="Arial" w:eastAsia="Times New Roman" w:hAnsi="Arial" w:cs="Arial"/>
+          <w:color w:val="8DD873" w:themeColor="accent6" w:themeTint="99"/>
           <w:kern w:val="0"/>
           <w:lang w:eastAsia="en-GB"/>
           <w14:ligatures w14:val="none"/>

</xml_diff>

<commit_message>
feat(scripts): rename stops report and add directional entrance checks
- Rename scripts/stops_ids_names.py to scripts/stops_report.py
- Add USE_ARTIFICIAL toggle to switch between subway_route_names_stop_ids
  and subway_route_names_stop_ids_artificial, switching the underlying
  stops/pathways files (raw vs. shared-platform stage) accordingly
- Add build_directed_entrance_edges to gtfs_utils.py to track
  platform<->entrance pathway connectivity per direction instead of merging
  both directions into one coverage set
- Annotate platform/entrance pairs in the report when only one direction's
  pathway exists, surfacing the asymmetry flagged in pathways_checks.ipynb
- Print show_entrances and use_artificial flags in the report header
</commit_message>
<xml_diff>
--- a/.work/06.02.docx
+++ b/.work/06.02.docx
@@ -1556,6 +1556,90 @@
         <w:spacing w:after="0" w:line="270" w:lineRule="atLeast"/>
         <w:rPr>
           <w:rFonts w:ascii="Arial" w:eastAsia="Times New Roman" w:hAnsi="Arial" w:cs="Arial"/>
+          <w:color w:val="8DD873" w:themeColor="accent6" w:themeTint="99"/>
+          <w:kern w:val="0"/>
+          <w:lang w:eastAsia="en-GB"/>
+          <w14:ligatures w14:val="none"/>
+        </w:rPr>
+      </w:pPr>
+      <w:r>
+        <w:rPr>
+          <w:rFonts w:ascii="Arial" w:eastAsia="Times New Roman" w:hAnsi="Arial" w:cs="Arial"/>
+          <w:color w:val="8DD873" w:themeColor="accent6" w:themeTint="99"/>
+          <w:kern w:val="0"/>
+          <w:lang w:eastAsia="en-GB"/>
+          <w14:ligatures w14:val="none"/>
+        </w:rPr>
+        <w:t>Nou diccionari (cal?)</w:t>
+      </w:r>
+    </w:p>
+    <w:p>
+      <w:pPr>
+        <w:pStyle w:val="ListParagraph"/>
+        <w:numPr>
+          <w:ilvl w:val="1"/>
+          <w:numId w:val="1"/>
+        </w:numPr>
+        <w:shd w:val="clear" w:color="auto" w:fill="FFFFFF"/>
+        <w:spacing w:after="0" w:line="270" w:lineRule="atLeast"/>
+        <w:rPr>
+          <w:rFonts w:ascii="Arial" w:eastAsia="Times New Roman" w:hAnsi="Arial" w:cs="Arial"/>
+          <w:color w:val="8DD873" w:themeColor="accent6" w:themeTint="99"/>
+          <w:kern w:val="0"/>
+          <w:lang w:eastAsia="en-GB"/>
+          <w14:ligatures w14:val="none"/>
+        </w:rPr>
+      </w:pPr>
+      <w:r>
+        <w:rPr>
+          <w:rFonts w:ascii="Arial" w:eastAsia="Times New Roman" w:hAnsi="Arial" w:cs="Arial"/>
+          <w:color w:val="8DD873" w:themeColor="accent6" w:themeTint="99"/>
+          <w:kern w:val="0"/>
+          <w:lang w:eastAsia="en-GB"/>
+          <w14:ligatures w14:val="none"/>
+        </w:rPr>
+        <w:t>Update readmes and workflow</w:t>
+      </w:r>
+    </w:p>
+    <w:p>
+      <w:pPr>
+        <w:pStyle w:val="ListParagraph"/>
+        <w:numPr>
+          <w:ilvl w:val="1"/>
+          <w:numId w:val="1"/>
+        </w:numPr>
+        <w:shd w:val="clear" w:color="auto" w:fill="FFFFFF"/>
+        <w:spacing w:after="0" w:line="270" w:lineRule="atLeast"/>
+        <w:rPr>
+          <w:rFonts w:ascii="Arial" w:eastAsia="Times New Roman" w:hAnsi="Arial" w:cs="Arial"/>
+          <w:color w:val="8DD873" w:themeColor="accent6" w:themeTint="99"/>
+          <w:kern w:val="0"/>
+          <w:lang w:eastAsia="en-GB"/>
+          <w14:ligatures w14:val="none"/>
+        </w:rPr>
+      </w:pPr>
+      <w:r>
+        <w:rPr>
+          <w:rFonts w:ascii="Arial" w:eastAsia="Times New Roman" w:hAnsi="Arial" w:cs="Arial"/>
+          <w:color w:val="8DD873" w:themeColor="accent6" w:themeTint="99"/>
+          <w:kern w:val="0"/>
+          <w:lang w:eastAsia="en-GB"/>
+          <w14:ligatures w14:val="none"/>
+        </w:rPr>
+        <w:t>Actualitzar referències</w:t>
+      </w:r>
+    </w:p>
+    <w:p>
+      <w:pPr>
+        <w:pStyle w:val="ListParagraph"/>
+        <w:numPr>
+          <w:ilvl w:val="1"/>
+          <w:numId w:val="1"/>
+        </w:numPr>
+        <w:shd w:val="clear" w:color="auto" w:fill="FFFFFF"/>
+        <w:spacing w:after="0" w:line="270" w:lineRule="atLeast"/>
+        <w:rPr>
+          <w:rFonts w:ascii="Arial" w:eastAsia="Times New Roman" w:hAnsi="Arial" w:cs="Arial"/>
           <w:color w:val="202020"/>
           <w:kern w:val="0"/>
           <w:lang w:eastAsia="en-GB"/>
@@ -1570,7 +1654,63 @@
           <w:lang w:eastAsia="en-GB"/>
           <w14:ligatures w14:val="none"/>
         </w:rPr>
-        <w:t>Nou diccionari (cal?)</w:t>
+        <w:t>Docu</w:t>
+      </w:r>
+    </w:p>
+    <w:p>
+      <w:pPr>
+        <w:pStyle w:val="ListParagraph"/>
+        <w:numPr>
+          <w:ilvl w:val="2"/>
+          <w:numId w:val="1"/>
+        </w:numPr>
+        <w:shd w:val="clear" w:color="auto" w:fill="FFFFFF"/>
+        <w:spacing w:after="0" w:line="270" w:lineRule="atLeast"/>
+        <w:rPr>
+          <w:rFonts w:ascii="Arial" w:eastAsia="Times New Roman" w:hAnsi="Arial" w:cs="Arial"/>
+          <w:color w:val="202020"/>
+          <w:kern w:val="0"/>
+          <w:lang w:eastAsia="en-GB"/>
+          <w14:ligatures w14:val="none"/>
+        </w:rPr>
+      </w:pPr>
+      <w:r>
+        <w:rPr>
+          <w:rFonts w:ascii="Arial" w:eastAsia="Times New Roman" w:hAnsi="Arial" w:cs="Arial"/>
+          <w:color w:val="202020"/>
+          <w:kern w:val="0"/>
+          <w:lang w:eastAsia="en-GB"/>
+          <w14:ligatures w14:val="none"/>
+        </w:rPr>
+        <w:t>Argumentar a la docu que és el mínim pw (i mínim trigues això en baixar-te i pujar a un metro que passi justament després) i per tal que no sigui gratis canviar-se de línia</w:t>
+      </w:r>
+    </w:p>
+    <w:p>
+      <w:pPr>
+        <w:pStyle w:val="ListParagraph"/>
+        <w:numPr>
+          <w:ilvl w:val="0"/>
+          <w:numId w:val="1"/>
+        </w:numPr>
+        <w:shd w:val="clear" w:color="auto" w:fill="FFFFFF"/>
+        <w:spacing w:after="0" w:line="270" w:lineRule="atLeast"/>
+        <w:rPr>
+          <w:rFonts w:ascii="Arial" w:eastAsia="Times New Roman" w:hAnsi="Arial" w:cs="Arial"/>
+          <w:color w:val="8DD873" w:themeColor="accent6" w:themeTint="99"/>
+          <w:kern w:val="0"/>
+          <w:lang w:eastAsia="en-GB"/>
+          <w14:ligatures w14:val="none"/>
+        </w:rPr>
+      </w:pPr>
+      <w:r>
+        <w:rPr>
+          <w:rFonts w:ascii="Arial" w:eastAsia="Times New Roman" w:hAnsi="Arial" w:cs="Arial"/>
+          <w:color w:val="8DD873" w:themeColor="accent6" w:themeTint="99"/>
+          <w:kern w:val="0"/>
+          <w:lang w:eastAsia="en-GB"/>
+          <w14:ligatures w14:val="none"/>
+        </w:rPr>
+        <w:t>scripts/stops_ids_names.py</w:t>
       </w:r>
     </w:p>
     <w:p>
@@ -1581,24 +1721,46 @@
           <w:numId w:val="1"/>
         </w:numPr>
         <w:shd w:val="clear" w:color="auto" w:fill="FFFFFF"/>
-        <w:spacing w:after="0" w:line="270" w:lineRule="atLeast"/>
-        <w:rPr>
-          <w:rFonts w:ascii="Arial" w:eastAsia="Times New Roman" w:hAnsi="Arial" w:cs="Arial"/>
-          <w:color w:val="8DD873" w:themeColor="accent6" w:themeTint="99"/>
-          <w:kern w:val="0"/>
-          <w:lang w:eastAsia="en-GB"/>
-          <w14:ligatures w14:val="none"/>
-        </w:rPr>
-      </w:pPr>
-      <w:r>
-        <w:rPr>
-          <w:rFonts w:ascii="Arial" w:eastAsia="Times New Roman" w:hAnsi="Arial" w:cs="Arial"/>
-          <w:color w:val="8DD873" w:themeColor="accent6" w:themeTint="99"/>
-          <w:kern w:val="0"/>
-          <w:lang w:eastAsia="en-GB"/>
-          <w14:ligatures w14:val="none"/>
-        </w:rPr>
-        <w:t>Update readmes and workflow</w:t>
+        <w:spacing w:line="270" w:lineRule="atLeast"/>
+        <w:rPr>
+          <w:rFonts w:ascii="Arial" w:eastAsia="Times New Roman" w:hAnsi="Arial" w:cs="Arial"/>
+          <w:color w:val="8DD873" w:themeColor="accent6" w:themeTint="99"/>
+          <w:kern w:val="0"/>
+          <w:lang w:val="ca-ES" w:eastAsia="en-GB"/>
+          <w14:ligatures w14:val="none"/>
+        </w:rPr>
+      </w:pPr>
+      <w:r>
+        <w:rPr>
+          <w:rFonts w:ascii="Arial" w:eastAsia="Times New Roman" w:hAnsi="Arial" w:cs="Arial"/>
+          <w:color w:val="8DD873" w:themeColor="accent6" w:themeTint="99"/>
+          <w:kern w:val="0"/>
+          <w:lang w:val="ca-ES" w:eastAsia="en-GB"/>
+          <w14:ligatures w14:val="none"/>
+        </w:rPr>
+        <w:t xml:space="preserve">Comprovar si al script que apareixen les parades amb les portes es fa </w:t>
+      </w:r>
+      <w:proofErr w:type="spellStart"/>
+      <w:r>
+        <w:rPr>
+          <w:rFonts w:ascii="Arial" w:eastAsia="Times New Roman" w:hAnsi="Arial" w:cs="Arial"/>
+          <w:color w:val="8DD873" w:themeColor="accent6" w:themeTint="99"/>
+          <w:kern w:val="0"/>
+          <w:lang w:val="ca-ES" w:eastAsia="en-GB"/>
+          <w14:ligatures w14:val="none"/>
+        </w:rPr>
+        <w:t>perque</w:t>
+      </w:r>
+      <w:proofErr w:type="spellEnd"/>
+      <w:r>
+        <w:rPr>
+          <w:rFonts w:ascii="Arial" w:eastAsia="Times New Roman" w:hAnsi="Arial" w:cs="Arial"/>
+          <w:color w:val="8DD873" w:themeColor="accent6" w:themeTint="99"/>
+          <w:kern w:val="0"/>
+          <w:lang w:val="ca-ES" w:eastAsia="en-GB"/>
+          <w14:ligatures w14:val="none"/>
+        </w:rPr>
+        <w:t xml:space="preserve"> les portes tenen el mateix codi o no</w:t>
       </w:r>
     </w:p>
     <w:p>
@@ -1609,25 +1771,49 @@
           <w:numId w:val="1"/>
         </w:numPr>
         <w:shd w:val="clear" w:color="auto" w:fill="FFFFFF"/>
-        <w:spacing w:after="0" w:line="270" w:lineRule="atLeast"/>
-        <w:rPr>
-          <w:rFonts w:ascii="Arial" w:eastAsia="Times New Roman" w:hAnsi="Arial" w:cs="Arial"/>
-          <w:color w:val="8DD873" w:themeColor="accent6" w:themeTint="99"/>
-          <w:kern w:val="0"/>
-          <w:lang w:eastAsia="en-GB"/>
-          <w14:ligatures w14:val="none"/>
-        </w:rPr>
-      </w:pPr>
-      <w:r>
-        <w:rPr>
-          <w:rFonts w:ascii="Arial" w:eastAsia="Times New Roman" w:hAnsi="Arial" w:cs="Arial"/>
-          <w:color w:val="8DD873" w:themeColor="accent6" w:themeTint="99"/>
-          <w:kern w:val="0"/>
-          <w:lang w:eastAsia="en-GB"/>
-          <w14:ligatures w14:val="none"/>
-        </w:rPr>
-        <w:t>Actualitzar referències</w:t>
-      </w:r>
+        <w:spacing w:line="270" w:lineRule="atLeast"/>
+        <w:rPr>
+          <w:rFonts w:ascii="Arial" w:eastAsia="Times New Roman" w:hAnsi="Arial" w:cs="Arial"/>
+          <w:color w:val="8DD873" w:themeColor="accent6" w:themeTint="99"/>
+          <w:kern w:val="0"/>
+          <w:lang w:val="ca-ES" w:eastAsia="en-GB"/>
+          <w14:ligatures w14:val="none"/>
+        </w:rPr>
+      </w:pPr>
+      <w:proofErr w:type="spellStart"/>
+      <w:r>
+        <w:rPr>
+          <w:rFonts w:ascii="Arial" w:eastAsia="Times New Roman" w:hAnsi="Arial" w:cs="Arial"/>
+          <w:color w:val="8DD873" w:themeColor="accent6" w:themeTint="99"/>
+          <w:kern w:val="0"/>
+          <w:lang w:val="ca-ES" w:eastAsia="en-GB"/>
+          <w14:ligatures w14:val="none"/>
+        </w:rPr>
+        <w:t>Canviarho</w:t>
+      </w:r>
+      <w:proofErr w:type="spellEnd"/>
+      <w:r>
+        <w:rPr>
+          <w:rFonts w:ascii="Arial" w:eastAsia="Times New Roman" w:hAnsi="Arial" w:cs="Arial"/>
+          <w:color w:val="8DD873" w:themeColor="accent6" w:themeTint="99"/>
+          <w:kern w:val="0"/>
+          <w:lang w:val="ca-ES" w:eastAsia="en-GB"/>
+          <w14:ligatures w14:val="none"/>
+        </w:rPr>
+        <w:t xml:space="preserve"> per si hi ha algun </w:t>
+      </w:r>
+      <w:proofErr w:type="spellStart"/>
+      <w:r>
+        <w:rPr>
+          <w:rFonts w:ascii="Arial" w:eastAsia="Times New Roman" w:hAnsi="Arial" w:cs="Arial"/>
+          <w:color w:val="8DD873" w:themeColor="accent6" w:themeTint="99"/>
+          <w:kern w:val="0"/>
+          <w:lang w:val="ca-ES" w:eastAsia="en-GB"/>
+          <w14:ligatures w14:val="none"/>
+        </w:rPr>
+        <w:t>pathway</w:t>
+      </w:r>
+      <w:proofErr w:type="spellEnd"/>
     </w:p>
     <w:p>
       <w:pPr>
@@ -1637,7 +1823,159 @@
           <w:numId w:val="1"/>
         </w:numPr>
         <w:shd w:val="clear" w:color="auto" w:fill="FFFFFF"/>
-        <w:spacing w:after="0" w:line="270" w:lineRule="atLeast"/>
+        <w:spacing w:line="270" w:lineRule="atLeast"/>
+        <w:rPr>
+          <w:rFonts w:ascii="Arial" w:eastAsia="Times New Roman" w:hAnsi="Arial" w:cs="Arial"/>
+          <w:color w:val="8DD873" w:themeColor="accent6" w:themeTint="99"/>
+          <w:kern w:val="0"/>
+          <w:lang w:val="ca-ES" w:eastAsia="en-GB"/>
+          <w14:ligatures w14:val="none"/>
+        </w:rPr>
+      </w:pPr>
+      <w:r>
+        <w:rPr>
+          <w:rFonts w:ascii="Arial" w:eastAsia="Times New Roman" w:hAnsi="Arial" w:cs="Arial"/>
+          <w:color w:val="8DD873" w:themeColor="accent6" w:themeTint="99"/>
+          <w:kern w:val="0"/>
+          <w:lang w:val="ca-ES" w:eastAsia="en-GB"/>
+          <w14:ligatures w14:val="none"/>
+        </w:rPr>
+        <w:t>Fer nou diccionari</w:t>
+      </w:r>
+    </w:p>
+    <w:p>
+      <w:pPr>
+        <w:pStyle w:val="ListParagraph"/>
+        <w:numPr>
+          <w:ilvl w:val="1"/>
+          <w:numId w:val="1"/>
+        </w:numPr>
+        <w:shd w:val="clear" w:color="auto" w:fill="FFFFFF"/>
+        <w:spacing w:line="270" w:lineRule="atLeast"/>
+        <w:rPr>
+          <w:rFonts w:ascii="Arial" w:eastAsia="Times New Roman" w:hAnsi="Arial" w:cs="Arial"/>
+          <w:color w:val="8DD873" w:themeColor="accent6" w:themeTint="99"/>
+          <w:kern w:val="0"/>
+          <w:lang w:val="ca-ES" w:eastAsia="en-GB"/>
+          <w14:ligatures w14:val="none"/>
+        </w:rPr>
+      </w:pPr>
+      <w:r>
+        <w:rPr>
+          <w:rFonts w:ascii="Arial" w:eastAsia="Times New Roman" w:hAnsi="Arial" w:cs="Arial"/>
+          <w:color w:val="8DD873" w:themeColor="accent6" w:themeTint="99"/>
+          <w:kern w:val="0"/>
+          <w:lang w:val="ca-ES" w:eastAsia="en-GB"/>
+          <w14:ligatures w14:val="none"/>
+        </w:rPr>
+        <w:t xml:space="preserve">Fer que al script hi hagi la </w:t>
+      </w:r>
+      <w:proofErr w:type="spellStart"/>
+      <w:r>
+        <w:rPr>
+          <w:rFonts w:ascii="Arial" w:eastAsia="Times New Roman" w:hAnsi="Arial" w:cs="Arial"/>
+          <w:color w:val="8DD873" w:themeColor="accent6" w:themeTint="99"/>
+          <w:kern w:val="0"/>
+          <w:lang w:val="ca-ES" w:eastAsia="en-GB"/>
+          <w14:ligatures w14:val="none"/>
+        </w:rPr>
+        <w:t>opcio</w:t>
+      </w:r>
+      <w:proofErr w:type="spellEnd"/>
+      <w:r>
+        <w:rPr>
+          <w:rFonts w:ascii="Arial" w:eastAsia="Times New Roman" w:hAnsi="Arial" w:cs="Arial"/>
+          <w:color w:val="8DD873" w:themeColor="accent6" w:themeTint="99"/>
+          <w:kern w:val="0"/>
+          <w:lang w:val="ca-ES" w:eastAsia="en-GB"/>
+          <w14:ligatures w14:val="none"/>
+        </w:rPr>
+        <w:t xml:space="preserve"> de decidir el diccionari</w:t>
+      </w:r>
+    </w:p>
+    <w:p>
+      <w:pPr>
+        <w:pStyle w:val="ListParagraph"/>
+        <w:numPr>
+          <w:ilvl w:val="1"/>
+          <w:numId w:val="1"/>
+        </w:numPr>
+        <w:shd w:val="clear" w:color="auto" w:fill="FFFFFF"/>
+        <w:spacing w:line="270" w:lineRule="atLeast"/>
+        <w:rPr>
+          <w:rFonts w:ascii="Arial" w:eastAsia="Times New Roman" w:hAnsi="Arial" w:cs="Arial"/>
+          <w:color w:val="8DD873" w:themeColor="accent6" w:themeTint="99"/>
+          <w:kern w:val="0"/>
+          <w:lang w:val="ca-ES" w:eastAsia="en-GB"/>
+          <w14:ligatures w14:val="none"/>
+        </w:rPr>
+      </w:pPr>
+      <w:r>
+        <w:rPr>
+          <w:rFonts w:ascii="Arial" w:eastAsia="Times New Roman" w:hAnsi="Arial" w:cs="Arial"/>
+          <w:color w:val="8DD873" w:themeColor="accent6" w:themeTint="99"/>
+          <w:kern w:val="0"/>
+          <w:lang w:val="ca-ES" w:eastAsia="en-GB"/>
+          <w14:ligatures w14:val="none"/>
+        </w:rPr>
+        <w:t>Canviar de nom el script?</w:t>
+      </w:r>
+    </w:p>
+    <w:p>
+      <w:pPr>
+        <w:pStyle w:val="ListParagraph"/>
+        <w:numPr>
+          <w:ilvl w:val="1"/>
+          <w:numId w:val="1"/>
+        </w:numPr>
+        <w:shd w:val="clear" w:color="auto" w:fill="FFFFFF"/>
+        <w:spacing w:line="270" w:lineRule="atLeast"/>
+        <w:rPr>
+          <w:rFonts w:ascii="Arial" w:eastAsia="Times New Roman" w:hAnsi="Arial" w:cs="Arial"/>
+          <w:color w:val="8DD873" w:themeColor="accent6" w:themeTint="99"/>
+          <w:kern w:val="0"/>
+          <w:lang w:val="ca-ES" w:eastAsia="en-GB"/>
+          <w14:ligatures w14:val="none"/>
+        </w:rPr>
+      </w:pPr>
+      <w:r>
+        <w:rPr>
+          <w:rFonts w:ascii="Arial" w:eastAsia="Times New Roman" w:hAnsi="Arial" w:cs="Arial"/>
+          <w:color w:val="8DD873" w:themeColor="accent6" w:themeTint="99"/>
+          <w:kern w:val="0"/>
+          <w:lang w:val="ca-ES" w:eastAsia="en-GB"/>
+          <w14:ligatures w14:val="none"/>
+        </w:rPr>
+        <w:t xml:space="preserve">Indicar quan el </w:t>
+      </w:r>
+      <w:proofErr w:type="spellStart"/>
+      <w:r>
+        <w:rPr>
+          <w:rFonts w:ascii="Arial" w:eastAsia="Times New Roman" w:hAnsi="Arial" w:cs="Arial"/>
+          <w:color w:val="8DD873" w:themeColor="accent6" w:themeTint="99"/>
+          <w:kern w:val="0"/>
+          <w:lang w:val="ca-ES" w:eastAsia="en-GB"/>
+          <w14:ligatures w14:val="none"/>
+        </w:rPr>
+        <w:t>pathway</w:t>
+      </w:r>
+      <w:proofErr w:type="spellEnd"/>
+      <w:r>
+        <w:rPr>
+          <w:rFonts w:ascii="Arial" w:eastAsia="Times New Roman" w:hAnsi="Arial" w:cs="Arial"/>
+          <w:color w:val="8DD873" w:themeColor="accent6" w:themeTint="99"/>
+          <w:kern w:val="0"/>
+          <w:lang w:val="ca-ES" w:eastAsia="en-GB"/>
+          <w14:ligatures w14:val="none"/>
+        </w:rPr>
+        <w:t xml:space="preserve"> no es en ambdues direccions</w:t>
+      </w:r>
+    </w:p>
+    <w:p>
+      <w:pPr>
+        <w:shd w:val="clear" w:color="auto" w:fill="FFFFFF"/>
+        <w:spacing w:after="0" w:line="270" w:lineRule="atLeast"/>
+        <w:ind w:left="1080"/>
         <w:rPr>
           <w:rFonts w:ascii="Arial" w:eastAsia="Times New Roman" w:hAnsi="Arial" w:cs="Arial"/>
           <w:color w:val="202020"/>
@@ -1646,44 +1984,6 @@
           <w14:ligatures w14:val="none"/>
         </w:rPr>
       </w:pPr>
-      <w:r>
-        <w:rPr>
-          <w:rFonts w:ascii="Arial" w:eastAsia="Times New Roman" w:hAnsi="Arial" w:cs="Arial"/>
-          <w:color w:val="202020"/>
-          <w:kern w:val="0"/>
-          <w:lang w:eastAsia="en-GB"/>
-          <w14:ligatures w14:val="none"/>
-        </w:rPr>
-        <w:t>Docu</w:t>
-      </w:r>
-    </w:p>
-    <w:p>
-      <w:pPr>
-        <w:pStyle w:val="ListParagraph"/>
-        <w:numPr>
-          <w:ilvl w:val="2"/>
-          <w:numId w:val="1"/>
-        </w:numPr>
-        <w:shd w:val="clear" w:color="auto" w:fill="FFFFFF"/>
-        <w:spacing w:after="0" w:line="270" w:lineRule="atLeast"/>
-        <w:rPr>
-          <w:rFonts w:ascii="Arial" w:eastAsia="Times New Roman" w:hAnsi="Arial" w:cs="Arial"/>
-          <w:color w:val="202020"/>
-          <w:kern w:val="0"/>
-          <w:lang w:eastAsia="en-GB"/>
-          <w14:ligatures w14:val="none"/>
-        </w:rPr>
-      </w:pPr>
-      <w:r>
-        <w:rPr>
-          <w:rFonts w:ascii="Arial" w:eastAsia="Times New Roman" w:hAnsi="Arial" w:cs="Arial"/>
-          <w:color w:val="202020"/>
-          <w:kern w:val="0"/>
-          <w:lang w:eastAsia="en-GB"/>
-          <w14:ligatures w14:val="none"/>
-        </w:rPr>
-        <w:t>Argumentar a la docu que és el mínim pw (i mínim trigues això en baixar-te i pujar a un metro que passi justament després) i per tal que no sigui gratis canviar-se de línia</w:t>
-      </w:r>
     </w:p>
     <w:p>
       <w:pPr>
@@ -1965,7 +2265,17 @@
           <w:sz w:val="20"/>
           <w:szCs w:val="20"/>
         </w:rPr>
-        <w:t xml:space="preserve">'s concern), and for the worst offenders it breaks the mean down by hour. That breakdown tells you whether high variance comes from a real, structured pattern (peak vs. off-peak times genuinely differ) or from noise/outliers around one stable value. The output of this script isn't consumed by anything downstream — it's a diagnostic gate you and your tutor use to decide whether a static mean-weight Dijkstra graph is an adequate model, or whether some edges need a different treatment (e.g. time-bucketed weights) before </w:t>
+        <w:t xml:space="preserve">'s concern), and for the worst offenders it breaks the mean down by hour. That breakdown tells you whether high variance comes from a real, structured pattern (peak vs. off-peak times genuinely differ) or from noise/outliers around one stable value. The output of </w:t>
+      </w:r>
+      <w:r>
+        <w:rPr>
+          <w:rFonts w:ascii="Segoe UI" w:hAnsi="Segoe UI" w:cs="Segoe UI"/>
+          <w:color w:val="BFBFBF" w:themeColor="background1" w:themeShade="BF"/>
+          <w:sz w:val="20"/>
+          <w:szCs w:val="20"/>
+        </w:rPr>
+        <w:lastRenderedPageBreak/>
+        <w:t xml:space="preserve">this script isn't consumed by anything downstream — it's a diagnostic gate you and your tutor use to decide whether a static mean-weight Dijkstra graph is an adequate model, or whether some edges need a different treatment (e.g. time-bucketed weights) before </w:t>
       </w:r>
       <w:r>
         <w:rPr>
@@ -2107,6 +2417,60 @@
 <file path=word/numbering.xml><?xml version="1.0" encoding="utf-8"?>
 <w:numbering xmlns:wpc="http://schemas.microsoft.com/office/word/2010/wordprocessingCanvas" xmlns:cx="http://schemas.microsoft.com/office/drawing/2014/chartex" xmlns:cx1="http://schemas.microsoft.com/office/drawing/2015/9/8/chartex" xmlns:cx2="http://schemas.microsoft.com/office/drawing/2015/10/21/chartex" xmlns:cx3="http://schemas.microsoft.com/office/drawing/2016/5/9/chartex" xmlns:cx4="http://schemas.microsoft.com/office/drawing/2016/5/10/chartex" xmlns:cx5="http://schemas.microsoft.com/office/drawing/2016/5/11/chartex" xmlns:cx6="http://schemas.microsoft.com/office/drawing/2016/5/12/chartex" xmlns:cx7="http://schemas.microsoft.com/office/drawing/2016/5/13/chartex" xmlns:cx8="http://schemas.microsoft.com/office/drawing/2016/5/14/chartex" xmlns:mc="http://schemas.openxmlformats.org/markup-compatibility/2006" xmlns:m="http://schemas.openxmlformats.org/officeDocument/2006/math" xmlns:aink="http://schemas.microsoft.com/office/drawing/2016/ink" xmlns:am3d="http://schemas.microsoft.com/office/drawing/2017/model3d" xmlns:oel="http://schemas.microsoft.com/office/2019/extlst" xmlns:r="http://schemas.openxmlformats.org/officeDocument/2006/relationships" xmlns:wp14="http://schemas.microsoft.com/office/word/2010/wordprocessingDrawing" xmlns:wp="http://schemas.openxmlformats.org/drawingml/2006/wordprocessingDrawing" xmlns:wpg="http://schemas.microsoft.com/office/word/2010/wordprocessingGroup" xmlns:wpi="http://schemas.microsoft.com/office/word/2010/wordprocessingInk" xmlns:wps="http://schemas.microsoft.com/office/word/2010/wordprocessingShape" xmlns:o="urn:schemas-microsoft-com:office:office" xmlns:v="urn:schemas-microsoft-com:vml" xmlns:w10="urn:schemas-microsoft-com:office:word" xmlns:w="http://schemas.openxmlformats.org/wordprocessingml/2006/main" xmlns:w14="http://schemas.microsoft.com/office/word/2010/wordml" xmlns:w15="http://schemas.microsoft.com/office/word/2012/wordml" xmlns:w16cex="http://schemas.microsoft.com/office/word/2018/wordml/cex" xmlns:w16cid="http://schemas.microsoft.com/office/word/2016/wordml/cid" xmlns:w16="http://schemas.microsoft.com/office/word/2018/wordml" xmlns:w16sdtdh="http://schemas.microsoft.com/office/word/2020/wordml/sdtdatahash" xmlns:w16sdtfl="http://schemas.microsoft.com/office/word/2024/wordml/sdtformatlock" xmlns:w16se="http://schemas.microsoft.com/office/word/2015/wordml/symex" xmlns:w16du="http://schemas.microsoft.com/office/word/2023/wordml/word16du" xmlns:wne="http://schemas.microsoft.com/office/word/2006/wordml" mc:Ignorable="w14 w15 w16se w16cid w16 w16cex w16sdtdh w16sdtfl w16du wp14">
   <w:abstractNum w:abstractNumId="0" w15:restartNumberingAfterBreak="0">
+    <w:nsid w:val="00000001"/>
+    <w:multiLevelType w:val="hybridMultilevel"/>
+    <w:tmpl w:val="FFFFFFFF"/>
+    <w:lvl w:ilvl="0" w:tplc="00000001">
+      <w:start w:val="1"/>
+      <w:numFmt w:val="bullet"/>
+      <w:lvlText w:val="•"/>
+      <w:lvlJc w:val="left"/>
+      <w:pPr>
+        <w:ind w:left="720" w:hanging="360"/>
+      </w:pPr>
+    </w:lvl>
+    <w:lvl w:ilvl="1" w:tplc="FFFFFFFF">
+      <w:numFmt w:val="decimal"/>
+      <w:lvlText w:val=""/>
+      <w:lvlJc w:val="left"/>
+    </w:lvl>
+    <w:lvl w:ilvl="2" w:tplc="FFFFFFFF">
+      <w:numFmt w:val="decimal"/>
+      <w:lvlText w:val=""/>
+      <w:lvlJc w:val="left"/>
+    </w:lvl>
+    <w:lvl w:ilvl="3" w:tplc="FFFFFFFF">
+      <w:numFmt w:val="decimal"/>
+      <w:lvlText w:val=""/>
+      <w:lvlJc w:val="left"/>
+    </w:lvl>
+    <w:lvl w:ilvl="4" w:tplc="FFFFFFFF">
+      <w:numFmt w:val="decimal"/>
+      <w:lvlText w:val=""/>
+      <w:lvlJc w:val="left"/>
+    </w:lvl>
+    <w:lvl w:ilvl="5" w:tplc="FFFFFFFF">
+      <w:numFmt w:val="decimal"/>
+      <w:lvlText w:val=""/>
+      <w:lvlJc w:val="left"/>
+    </w:lvl>
+    <w:lvl w:ilvl="6" w:tplc="FFFFFFFF">
+      <w:numFmt w:val="decimal"/>
+      <w:lvlText w:val=""/>
+      <w:lvlJc w:val="left"/>
+    </w:lvl>
+    <w:lvl w:ilvl="7" w:tplc="FFFFFFFF">
+      <w:numFmt w:val="decimal"/>
+      <w:lvlText w:val=""/>
+      <w:lvlJc w:val="left"/>
+    </w:lvl>
+    <w:lvl w:ilvl="8" w:tplc="FFFFFFFF">
+      <w:numFmt w:val="decimal"/>
+      <w:lvlText w:val=""/>
+      <w:lvlJc w:val="left"/>
+    </w:lvl>
+  </w:abstractNum>
+  <w:abstractNum w:abstractNumId="1" w15:restartNumberingAfterBreak="0">
     <w:nsid w:val="0A6456C0"/>
     <w:multiLevelType w:val="multilevel"/>
     <w:tmpl w:val="B78C145A"/>
@@ -2219,7 +2583,7 @@
       </w:pPr>
     </w:lvl>
   </w:abstractNum>
-  <w:abstractNum w:abstractNumId="1" w15:restartNumberingAfterBreak="0">
+  <w:abstractNum w:abstractNumId="2" w15:restartNumberingAfterBreak="0">
     <w:nsid w:val="6D1B6A08"/>
     <w:multiLevelType w:val="hybridMultilevel"/>
     <w:tmpl w:val="31AACC14"/>
@@ -2332,9 +2696,12 @@
     </w:lvl>
   </w:abstractNum>
   <w:num w:numId="1" w16cid:durableId="79445302">
+    <w:abstractNumId w:val="2"/>
+  </w:num>
+  <w:num w:numId="2" w16cid:durableId="616913677">
     <w:abstractNumId w:val="1"/>
   </w:num>
-  <w:num w:numId="2" w16cid:durableId="616913677">
+  <w:num w:numId="3" w16cid:durableId="1224828724">
     <w:abstractNumId w:val="0"/>
   </w:num>
 </w:numbering>
@@ -2943,7 +3310,6 @@
   <w:style w:type="character" w:default="1" w:styleId="DefaultParagraphFont">
     <w:name w:val="Default Paragraph Font"/>
     <w:uiPriority w:val="1"/>
-    <w:semiHidden/>
     <w:unhideWhenUsed/>
   </w:style>
   <w:style w:type="table" w:default="1" w:styleId="TableNormal">

</xml_diff>